<commit_message>
Actualizacion info sobre GeoJson
</commit_message>
<xml_diff>
--- a/Descripcion y objetivos.docx
+++ b/Descripcion y objetivos.docx
@@ -1,6 +1,6 @@
 
 <file path=word/document.xml><?xml version="1.0" encoding="utf-8"?>
-<w:document xmlns:wpc="http://schemas.microsoft.com/office/word/2010/wordprocessingCanvas" xmlns:cx="http://schemas.microsoft.com/office/drawing/2014/chartex" xmlns:mc="http://schemas.openxmlformats.org/markup-compatibility/2006" xmlns:o="urn:schemas-microsoft-com:office:office" xmlns:r="http://schemas.openxmlformats.org/officeDocument/2006/relationships" xmlns:m="http://schemas.openxmlformats.org/officeDocument/2006/math" xmlns:v="urn:schemas-microsoft-com:vml" xmlns:wp14="http://schemas.microsoft.com/office/word/2010/wordprocessingDrawing" xmlns:wp="http://schemas.openxmlformats.org/drawingml/2006/wordprocessingDrawing" xmlns:w10="urn:schemas-microsoft-com:office:word" xmlns:w="http://schemas.openxmlformats.org/wordprocessingml/2006/main" xmlns:w14="http://schemas.microsoft.com/office/word/2010/wordml" xmlns:w15="http://schemas.microsoft.com/office/word/2012/wordml" xmlns:w16se="http://schemas.microsoft.com/office/word/2015/wordml/symex" xmlns:wpg="http://schemas.microsoft.com/office/word/2010/wordprocessingGroup" xmlns:wpi="http://schemas.microsoft.com/office/word/2010/wordprocessingInk" xmlns:wne="http://schemas.microsoft.com/office/word/2006/wordml" xmlns:wps="http://schemas.microsoft.com/office/word/2010/wordprocessingShape" mc:Ignorable="w14 w15 w16se wp14">
+<w:document xmlns:wpc="http://schemas.microsoft.com/office/word/2010/wordprocessingCanvas" xmlns:cx="http://schemas.microsoft.com/office/drawing/2014/chartex" xmlns:cx1="http://schemas.microsoft.com/office/drawing/2015/9/8/chartex" xmlns:cx2="http://schemas.microsoft.com/office/drawing/2015/10/21/chartex" xmlns:cx3="http://schemas.microsoft.com/office/drawing/2016/5/9/chartex" xmlns:cx4="http://schemas.microsoft.com/office/drawing/2016/5/10/chartex" xmlns:cx5="http://schemas.microsoft.com/office/drawing/2016/5/11/chartex" xmlns:cx6="http://schemas.microsoft.com/office/drawing/2016/5/12/chartex" xmlns:cx7="http://schemas.microsoft.com/office/drawing/2016/5/13/chartex" xmlns:cx8="http://schemas.microsoft.com/office/drawing/2016/5/14/chartex" xmlns:mc="http://schemas.openxmlformats.org/markup-compatibility/2006" xmlns:aink="http://schemas.microsoft.com/office/drawing/2016/ink" xmlns:am3d="http://schemas.microsoft.com/office/drawing/2017/model3d" xmlns:o="urn:schemas-microsoft-com:office:office" xmlns:oel="http://schemas.microsoft.com/office/2019/extlst" xmlns:r="http://schemas.openxmlformats.org/officeDocument/2006/relationships" xmlns:m="http://schemas.openxmlformats.org/officeDocument/2006/math" xmlns:v="urn:schemas-microsoft-com:vml" xmlns:wp14="http://schemas.microsoft.com/office/word/2010/wordprocessingDrawing" xmlns:wp="http://schemas.openxmlformats.org/drawingml/2006/wordprocessingDrawing" xmlns:w10="urn:schemas-microsoft-com:office:word" xmlns:w="http://schemas.openxmlformats.org/wordprocessingml/2006/main" xmlns:w14="http://schemas.microsoft.com/office/word/2010/wordml" xmlns:w15="http://schemas.microsoft.com/office/word/2012/wordml" xmlns:w16cex="http://schemas.microsoft.com/office/word/2018/wordml/cex" xmlns:w16cid="http://schemas.microsoft.com/office/word/2016/wordml/cid" xmlns:w16="http://schemas.microsoft.com/office/word/2018/wordml" xmlns:w16du="http://schemas.microsoft.com/office/word/2023/wordml/word16du" xmlns:w16sdtdh="http://schemas.microsoft.com/office/word/2020/wordml/sdtdatahash" xmlns:w16sdtfl="http://schemas.microsoft.com/office/word/2024/wordml/sdtformatlock" xmlns:w16se="http://schemas.microsoft.com/office/word/2015/wordml/symex" xmlns:wpg="http://schemas.microsoft.com/office/word/2010/wordprocessingGroup" xmlns:wpi="http://schemas.microsoft.com/office/word/2010/wordprocessingInk" xmlns:wne="http://schemas.microsoft.com/office/word/2006/wordml" xmlns:wps="http://schemas.microsoft.com/office/word/2010/wordprocessingShape" mc:Ignorable="w14 w15 w16se w16cid w16 w16cex w16sdtdh w16sdtfl w16du wp14">
   <w:body>
     <w:p>
       <w:pPr>
@@ -147,8 +147,6 @@
       <w:r>
         <w:t xml:space="preserve">Tiene tamaño &gt; 0 </w:t>
       </w:r>
-      <w:bookmarkStart w:id="0" w:name="_GoBack"/>
-      <w:bookmarkEnd w:id="0"/>
     </w:p>
     <w:p>
       <w:r>
@@ -520,8 +518,14 @@
     <w:p>
       <w:pPr>
         <w:ind w:left="708"/>
-      </w:pPr>
-      <w:r>
+        <w:rPr>
+          <w:lang w:val="en-US"/>
+        </w:rPr>
+      </w:pPr>
+      <w:r>
+        <w:rPr>
+          <w:lang w:val="en-US"/>
+        </w:rPr>
         <w:t>&lt;dependency&gt;</w:t>
       </w:r>
     </w:p>
@@ -533,6 +537,9 @@
         </w:rPr>
       </w:pPr>
       <w:r>
+        <w:rPr>
+          <w:lang w:val="en-US"/>
+        </w:rPr>
         <w:t xml:space="preserve">    </w:t>
       </w:r>
       <w:r>
@@ -590,7 +597,7 @@
           <w:lang w:eastAsia="es-ES"/>
         </w:rPr>
         <w:drawing>
-          <wp:inline distT="0" distB="0" distL="0" distR="0" wp14:anchorId="6804633E" wp14:editId="4947D767">
+          <wp:inline distT="0" distB="0" distL="0" distR="0" wp14:anchorId="072898BB" wp14:editId="3B77E4BF">
             <wp:extent cx="4067175" cy="2033588"/>
             <wp:effectExtent l="0" t="0" r="0" b="5080"/>
             <wp:docPr id="1" name="Imagen 1"/>
@@ -632,18 +639,35 @@
       </w:pPr>
     </w:p>
     <w:p>
-      <w:r>
+      <w:pPr>
+        <w:rPr>
+          <w:lang w:val="en-US"/>
+        </w:rPr>
+      </w:pPr>
+      <w:r>
+        <w:rPr>
+          <w:lang w:val="en-US"/>
+        </w:rPr>
         <w:t xml:space="preserve">4º </w:t>
       </w:r>
       <w:r>
+        <w:rPr>
+          <w:lang w:val="en-US"/>
+        </w:rPr>
         <w:t>WebDriverManager</w:t>
       </w:r>
     </w:p>
     <w:p>
       <w:pPr>
         <w:ind w:left="708"/>
-      </w:pPr>
-      <w:r>
+        <w:rPr>
+          <w:lang w:val="en-US"/>
+        </w:rPr>
+      </w:pPr>
+      <w:r>
+        <w:rPr>
+          <w:lang w:val="en-US"/>
+        </w:rPr>
         <w:t>&lt;dependency&gt;</w:t>
       </w:r>
     </w:p>
@@ -655,6 +679,9 @@
         </w:rPr>
       </w:pPr>
       <w:r>
+        <w:rPr>
+          <w:lang w:val="en-US"/>
+        </w:rPr>
         <w:t xml:space="preserve">    </w:t>
       </w:r>
       <w:r>
@@ -696,8 +723,14 @@
     <w:p>
       <w:pPr>
         <w:ind w:left="708"/>
-      </w:pPr>
-      <w:r>
+        <w:rPr>
+          <w:lang w:val="en-US"/>
+        </w:rPr>
+      </w:pPr>
+      <w:r>
+        <w:rPr>
+          <w:lang w:val="en-US"/>
+        </w:rPr>
         <w:t>&lt;/dependency&gt;</w:t>
       </w:r>
     </w:p>
@@ -725,24 +758,12 @@
     <w:p>
       <w:pPr>
         <w:ind w:left="708" w:firstLine="708"/>
-        <w:rPr>
-          <w:lang w:val="en-US"/>
-        </w:rPr>
-      </w:pPr>
-      <w:r>
-        <w:rPr>
-          <w:lang w:val="en-US"/>
-        </w:rPr>
+      </w:pPr>
+      <w:r>
         <w:t>WebDriver driver = new ChromeDriver();</w:t>
       </w:r>
     </w:p>
-    <w:p>
-      <w:pPr>
-        <w:rPr>
-          <w:lang w:val="en-US"/>
-        </w:rPr>
-      </w:pPr>
-    </w:p>
+    <w:p/>
     <w:p>
       <w:r>
         <w:t xml:space="preserve">Si no funciona automáticamente, descargar driver a mano </w:t>
@@ -789,7 +810,7 @@
           <w:noProof/>
         </w:rPr>
         <w:drawing>
-          <wp:anchor distT="0" distB="0" distL="114300" distR="114300" simplePos="0" relativeHeight="251658240" behindDoc="1" locked="0" layoutInCell="1" allowOverlap="1" wp14:anchorId="07FFE222" wp14:editId="7E92D5B7">
+          <wp:anchor distT="0" distB="0" distL="114300" distR="114300" simplePos="0" relativeHeight="251658240" behindDoc="1" locked="0" layoutInCell="1" allowOverlap="1" wp14:anchorId="018F50AD" wp14:editId="7216B5CA">
             <wp:simplePos x="0" y="0"/>
             <wp:positionH relativeFrom="column">
               <wp:posOffset>453390</wp:posOffset>
@@ -972,16 +993,16 @@
           <w:color w:val="444746"/>
           <w:sz w:val="20"/>
           <w:szCs w:val="20"/>
-          <w:lang w:eastAsia="es-ES"/>
-        </w:rPr>
-      </w:pPr>
-      <w:r>
-        <w:rPr>
-          <w:rFonts w:ascii="Segoe UI" w:eastAsia="Times New Roman" w:hAnsi="Segoe UI" w:cs="Segoe UI"/>
-          <w:color w:val="444746"/>
-          <w:sz w:val="20"/>
-          <w:szCs w:val="20"/>
-          <w:lang w:eastAsia="es-ES"/>
+          <w:lang w:val="en-US" w:eastAsia="es-ES"/>
+        </w:rPr>
+      </w:pPr>
+      <w:r>
+        <w:rPr>
+          <w:rFonts w:ascii="Segoe UI" w:eastAsia="Times New Roman" w:hAnsi="Segoe UI" w:cs="Segoe UI"/>
+          <w:color w:val="444746"/>
+          <w:sz w:val="20"/>
+          <w:szCs w:val="20"/>
+          <w:lang w:val="en-US" w:eastAsia="es-ES"/>
         </w:rPr>
         <w:t>5º Primera prueba</w:t>
       </w:r>
@@ -995,7 +1016,7 @@
           <w:color w:val="444746"/>
           <w:sz w:val="20"/>
           <w:szCs w:val="20"/>
-          <w:lang w:eastAsia="es-ES"/>
+          <w:lang w:val="en-US" w:eastAsia="es-ES"/>
         </w:rPr>
       </w:pPr>
     </w:p>
@@ -1017,7 +1038,7 @@
           <w:color w:val="444746"/>
           <w:sz w:val="20"/>
           <w:szCs w:val="20"/>
-          <w:lang w:eastAsia="es-ES"/>
+          <w:lang w:val="en-US" w:eastAsia="es-ES"/>
         </w:rPr>
         <w:t xml:space="preserve">    </w:t>
       </w:r>
@@ -1385,16 +1406,16 @@
           <w:color w:val="444746"/>
           <w:sz w:val="20"/>
           <w:szCs w:val="20"/>
-          <w:lang w:eastAsia="es-ES"/>
-        </w:rPr>
-      </w:pPr>
-      <w:r>
-        <w:rPr>
-          <w:rFonts w:ascii="Segoe UI" w:eastAsia="Times New Roman" w:hAnsi="Segoe UI" w:cs="Segoe UI"/>
-          <w:color w:val="444746"/>
-          <w:sz w:val="20"/>
-          <w:szCs w:val="20"/>
-          <w:lang w:eastAsia="es-ES"/>
+          <w:lang w:val="en-US" w:eastAsia="es-ES"/>
+        </w:rPr>
+      </w:pPr>
+      <w:r>
+        <w:rPr>
+          <w:rFonts w:ascii="Segoe UI" w:eastAsia="Times New Roman" w:hAnsi="Segoe UI" w:cs="Segoe UI"/>
+          <w:color w:val="444746"/>
+          <w:sz w:val="20"/>
+          <w:szCs w:val="20"/>
+          <w:lang w:val="en-US" w:eastAsia="es-ES"/>
         </w:rPr>
         <w:t>&lt;/dependency&gt;</w:t>
       </w:r>
@@ -1408,7 +1429,7 @@
           <w:color w:val="444746"/>
           <w:sz w:val="20"/>
           <w:szCs w:val="20"/>
-          <w:lang w:eastAsia="es-ES"/>
+          <w:lang w:val="en-US" w:eastAsia="es-ES"/>
         </w:rPr>
       </w:pPr>
     </w:p>
@@ -1421,16 +1442,16 @@
           <w:color w:val="444746"/>
           <w:sz w:val="20"/>
           <w:szCs w:val="20"/>
-          <w:lang w:eastAsia="es-ES"/>
-        </w:rPr>
-      </w:pPr>
-      <w:r>
-        <w:rPr>
-          <w:rFonts w:ascii="Segoe UI" w:eastAsia="Times New Roman" w:hAnsi="Segoe UI" w:cs="Segoe UI"/>
-          <w:color w:val="444746"/>
-          <w:sz w:val="20"/>
-          <w:szCs w:val="20"/>
-          <w:lang w:eastAsia="es-ES"/>
+          <w:lang w:val="en-US" w:eastAsia="es-ES"/>
+        </w:rPr>
+      </w:pPr>
+      <w:r>
+        <w:rPr>
+          <w:rFonts w:ascii="Segoe UI" w:eastAsia="Times New Roman" w:hAnsi="Segoe UI" w:cs="Segoe UI"/>
+          <w:color w:val="444746"/>
+          <w:sz w:val="20"/>
+          <w:szCs w:val="20"/>
+          <w:lang w:val="en-US" w:eastAsia="es-ES"/>
         </w:rPr>
         <w:t xml:space="preserve">BBDD </w:t>
       </w:r>
@@ -1568,7 +1589,15 @@
       </w:pPr>
     </w:p>
     <w:p>
-      <w:r>
+      <w:pPr>
+        <w:rPr>
+          <w:lang w:val="en-US"/>
+        </w:rPr>
+      </w:pPr>
+      <w:r>
+        <w:rPr>
+          <w:lang w:val="en-US"/>
+        </w:rPr>
         <w:t xml:space="preserve">6º Configurar </w:t>
       </w:r>
     </w:p>
@@ -1763,6 +1792,11 @@
       </w:r>
     </w:p>
     <w:p>
+      <w:pPr>
+        <w:rPr>
+          <w:lang w:val="en-US"/>
+        </w:rPr>
+      </w:pPr>
       <w:r>
         <w:rPr>
           <w:lang w:val="en-US"/>
@@ -1770,6 +1804,9 @@
         <w:tab/>
       </w:r>
       <w:r>
+        <w:rPr>
+          <w:lang w:val="en-US"/>
+        </w:rPr>
         <w:t>PDF</w:t>
       </w:r>
     </w:p>
@@ -2027,10 +2064,563 @@
         <w:t>Carpeta año ∟ mes</w:t>
       </w:r>
     </w:p>
-    <w:p>
-      <w:pPr>
-        <w:ind w:left="360"/>
-      </w:pPr>
+    <w:p/>
+    <w:p/>
+    <w:p>
+      <w:r>
+        <w:br w:type="page"/>
+      </w:r>
+    </w:p>
+    <w:p>
+      <w:r>
+        <w:rPr>
+          <w:b/>
+          <w:bCs/>
+          <w:color w:val="00B050"/>
+          <w:sz w:val="48"/>
+          <w:szCs w:val="48"/>
+          <w:highlight w:val="cyan"/>
+          <w:u w:val="single"/>
+        </w:rPr>
+        <w:lastRenderedPageBreak/>
+        <w:t>GEOJson</w:t>
+      </w:r>
+      <w:r>
+        <w:rPr>
+          <w:b/>
+          <w:bCs/>
+          <w:color w:val="00B050"/>
+          <w:sz w:val="48"/>
+          <w:szCs w:val="48"/>
+        </w:rPr>
+        <w:t> </w:t>
+      </w:r>
+      <w:r>
+        <w:rPr>
+          <w:b/>
+          <w:bCs/>
+        </w:rPr>
+        <w:t>– Diario e Historico </w:t>
+      </w:r>
+      <w:r>
+        <w:t> </w:t>
+      </w:r>
+    </w:p>
+    <w:p>
+      <w:pPr>
+        <w:rPr>
+          <w:b/>
+          <w:bCs/>
+          <w:sz w:val="28"/>
+          <w:szCs w:val="28"/>
+        </w:rPr>
+      </w:pPr>
+      <w:r>
+        <w:rPr>
+          <w:b/>
+          <w:bCs/>
+          <w:sz w:val="28"/>
+          <w:szCs w:val="28"/>
+        </w:rPr>
+        <w:t>Campos del JSON diario</w:t>
+      </w:r>
+    </w:p>
+    <w:p>
+      <w:r>
+        <w:t>El archivo JSON diario contendrá la información completa de cada estación de servicio obtenida desde el portal oficial de precios de carburantes. Cada registro representa una gasolinera y contiene los siguientes campos:</w:t>
+      </w:r>
+    </w:p>
+    <w:p>
+      <w:r>
+        <w:br/>
+      </w:r>
+      <w:r>
+        <w:t>Fecha del registro</w:t>
+      </w:r>
+    </w:p>
+    <w:p>
+      <w:r>
+        <w:t>ID de estación (IDEESS)</w:t>
+      </w:r>
+    </w:p>
+    <w:p>
+      <w:r>
+        <w:t>Dirección</w:t>
+      </w:r>
+    </w:p>
+    <w:p>
+      <w:r>
+        <w:t>Horario</w:t>
+      </w:r>
+    </w:p>
+    <w:p>
+      <w:r>
+        <w:t>Latitud</w:t>
+      </w:r>
+    </w:p>
+    <w:p>
+      <w:r>
+        <w:t>Longitud</w:t>
+      </w:r>
+    </w:p>
+    <w:p>
+      <w:r>
+        <w:t>Municipio</w:t>
+      </w:r>
+    </w:p>
+    <w:p>
+      <w:r>
+        <w:t>Provincia</w:t>
+      </w:r>
+    </w:p>
+    <w:p>
+      <w:r>
+        <w:t>Rótulo (marca)</w:t>
+      </w:r>
+    </w:p>
+    <w:p>
+      <w:r>
+        <w:t>Precios de combustibles (varios)</w:t>
+      </w:r>
+    </w:p>
+    <w:p>
+      <w:r>
+        <w:t>Porcentaje bioetanol</w:t>
+      </w:r>
+    </w:p>
+    <w:p>
+      <w:r>
+        <w:t>Porcentaje éster metílico</w:t>
+      </w:r>
+      <w:r>
+        <w:br/>
+      </w:r>
+    </w:p>
+    <w:p>
+      <w:r>
+        <w:t xml:space="preserve">El archivo se genera en formato </w:t>
+      </w:r>
+      <w:r>
+        <w:rPr>
+          <w:b/>
+          <w:bCs/>
+        </w:rPr>
+        <w:t>GeoJSON</w:t>
+      </w:r>
+      <w:r>
+        <w:t>, donde cada estación aparece como una entidad geográfica con coordenadas (latitud y longitud) y sus propiedades asociadas.</w:t>
+      </w:r>
+    </w:p>
+    <w:p/>
+    <w:p>
+      <w:pPr>
+        <w:rPr>
+          <w:b/>
+          <w:bCs/>
+          <w:sz w:val="28"/>
+          <w:szCs w:val="28"/>
+        </w:rPr>
+      </w:pPr>
+      <w:r>
+        <w:rPr>
+          <w:b/>
+          <w:bCs/>
+          <w:sz w:val="28"/>
+          <w:szCs w:val="28"/>
+        </w:rPr>
+        <w:t>Funcionalidades sencillas que puede implementar la app</w:t>
+      </w:r>
+    </w:p>
+    <w:p>
+      <w:r>
+        <w:t>La aplicación móvil puede implementar de forma relativamente simple varias funcionalidades utilizando los datos del JSON diario.</w:t>
+      </w:r>
+    </w:p>
+    <w:p>
+      <w:r>
+        <w:br/>
+        <w:t>Mostrar todas las gasolineras en un mapa utilizando sus coordenadas geográficas.</w:t>
+      </w:r>
+    </w:p>
+    <w:p>
+      <w:r>
+        <w:t>Buscar gasolineras cercanas a la ubicación actual del usuario.</w:t>
+      </w:r>
+    </w:p>
+    <w:p>
+      <w:r>
+        <w:t>Mostrar información detallada de cada estación al pulsar sobre el punto del mapa (marca, dirección, precios, horario).</w:t>
+      </w:r>
+    </w:p>
+    <w:p>
+      <w:r>
+        <w:t>Ordenar gasolineras por precio de gasolina o gasóleo.</w:t>
+      </w:r>
+    </w:p>
+    <w:p>
+      <w:r>
+        <w:t>Filtrar estaciones por tipo de combustible (gasolina o diésel).</w:t>
+      </w:r>
+    </w:p>
+    <w:p>
+      <w:r>
+        <w:t>Filtrar estaciones por provincia o municipio.</w:t>
+      </w:r>
+    </w:p>
+    <w:p>
+      <w:r>
+        <w:lastRenderedPageBreak/>
+        <w:t>Mostrar únicamente estaciones abiertas según el horario.</w:t>
+      </w:r>
+    </w:p>
+    <w:p>
+      <w:r>
+        <w:t>Mostrar estaciones de una marca concreta (Repsol, Cepsa, BP, etc.).</w:t>
+      </w:r>
+    </w:p>
+    <w:p>
+      <w:r>
+        <w:t>Guardar hasta tres gasolineras favoritas para acceso rápido.</w:t>
+      </w:r>
+    </w:p>
+    <w:p>
+      <w:r>
+        <w:t>Mostrar el precio actual de las estaciones favoritas.</w:t>
+      </w:r>
+    </w:p>
+    <w:p>
+      <w:r>
+        <w:t>Mostrar la gasolinera más barata en una provincia seleccionada.</w:t>
+      </w:r>
+    </w:p>
+    <w:p>
+      <w:r>
+        <w:t>Mostrar la gasolinera más barata cerca de la ubicación actual.</w:t>
+      </w:r>
+    </w:p>
+    <w:p>
+      <w:r>
+        <w:t>Mostrar el precio medio del combustible en una provincia.</w:t>
+      </w:r>
+    </w:p>
+    <w:p>
+      <w:r>
+        <w:t>Actualizar los datos automáticamente cuando exista un nuevo JSON diario.</w:t>
+      </w:r>
+    </w:p>
+    <w:p>
+      <w:r>
+        <w:t>Indicar si el precio fue actualizado recientemente usando la fecha de actualización.</w:t>
+      </w:r>
+    </w:p>
+    <w:p>
+      <w:r>
+        <w:t>Mostrar la distancia aproximada hasta cada estación desde la posición del usuario.</w:t>
+      </w:r>
+      <w:r>
+        <w:br/>
+      </w:r>
+    </w:p>
+    <w:p>
+      <w:pPr>
+        <w:rPr>
+          <w:b/>
+          <w:bCs/>
+        </w:rPr>
+      </w:pPr>
+      <w:r>
+        <w:rPr>
+          <w:b/>
+          <w:bCs/>
+          <w:sz w:val="28"/>
+          <w:szCs w:val="28"/>
+        </w:rPr>
+        <w:t xml:space="preserve">Funcionalidades avanzadas </w:t>
+      </w:r>
+      <w:r>
+        <w:rPr>
+          <w:b/>
+          <w:bCs/>
+        </w:rPr>
+        <w:t>(plus del proyecto)</w:t>
+      </w:r>
+    </w:p>
+    <w:p>
+      <w:r>
+        <w:t>Estas funcionalidades pueden implementarse como ampliaciones del proyecto:</w:t>
+      </w:r>
+    </w:p>
+    <w:p>
+      <w:r>
+        <w:br/>
+        <w:t>Mostrar la evolución del precio de gasolina o diésel mediante una gráfica histórica.</w:t>
+      </w:r>
+    </w:p>
+    <w:p>
+      <w:r>
+        <w:t>Comparar la evolución de precios entre varias gasolineras favoritas.</w:t>
+      </w:r>
+    </w:p>
+    <w:p>
+      <w:r>
+        <w:t>Mostrar la evolución media del precio en una provincia a lo largo del tiempo.</w:t>
+      </w:r>
+    </w:p>
+    <w:p>
+      <w:r>
+        <w:t>Detectar subidas o bajadas significativas del precio en los últimos días.</w:t>
+      </w:r>
+    </w:p>
+    <w:p>
+      <w:r>
+        <w:t>Mostrar la gasolinera más barata en una ruta introducida por el usuario.</w:t>
+      </w:r>
+    </w:p>
+    <w:p>
+      <w:r>
+        <w:t>Filtrar gasolineras dentro de un radio cercano a una ruta de viaje.</w:t>
+      </w:r>
+    </w:p>
+    <w:p>
+      <w:r>
+        <w:t>Recomendar paradas de repostaje en función del precio y la distancia al trayecto.</w:t>
+      </w:r>
+      <w:r>
+        <w:br/>
+      </w:r>
+    </w:p>
+    <w:p/>
+    <w:p>
+      <w:pPr>
+        <w:rPr>
+          <w:b/>
+          <w:bCs/>
+          <w:sz w:val="28"/>
+          <w:szCs w:val="28"/>
+        </w:rPr>
+      </w:pPr>
+      <w:r>
+        <w:rPr>
+          <w:b/>
+          <w:bCs/>
+          <w:sz w:val="28"/>
+          <w:szCs w:val="28"/>
+        </w:rPr>
+        <w:t>Campos del archivo histórico</w:t>
+      </w:r>
+    </w:p>
+    <w:p>
+      <w:r>
+        <w:t>El archivo histórico almacenará únicamente los datos necesarios para analizar la evolución del precio, reduciendo considerablemente el tamaño del dataset.</w:t>
+      </w:r>
+    </w:p>
+    <w:p>
+      <w:r>
+        <w:br/>
+        <w:t>ID de la estación de servicio</w:t>
+      </w:r>
+      <w:r>
+        <w:br/>
+        <w:t>Precio gasolina 95</w:t>
+      </w:r>
+      <w:r>
+        <w:br/>
+        <w:t>Precio gasóleo A</w:t>
+      </w:r>
+      <w:r>
+        <w:br/>
+        <w:t>Fecha del registro</w:t>
+      </w:r>
+    </w:p>
+    <w:p/>
+    <w:p>
+      <w:r>
+        <w:t>Este archivo permitirá reconstruir la evolución temporal de los precios sin almacenar todos los datos descriptivos de cada estación.</w:t>
+      </w:r>
+    </w:p>
+    <w:p/>
+    <w:p>
+      <w:pPr>
+        <w:rPr>
+          <w:b/>
+          <w:bCs/>
+          <w:sz w:val="28"/>
+          <w:szCs w:val="28"/>
+        </w:rPr>
+      </w:pPr>
+      <w:r>
+        <w:rPr>
+          <w:b/>
+          <w:bCs/>
+          <w:sz w:val="28"/>
+          <w:szCs w:val="28"/>
+        </w:rPr>
+        <w:t>Uso de GeoJSON</w:t>
+      </w:r>
+    </w:p>
+    <w:p>
+      <w:r>
+        <w:t xml:space="preserve">Actualmente los datos se generan en formato </w:t>
+      </w:r>
+      <w:r>
+        <w:rPr>
+          <w:b/>
+          <w:bCs/>
+        </w:rPr>
+        <w:t>GeoJSON</w:t>
+      </w:r>
+      <w:r>
+        <w:t>.</w:t>
+      </w:r>
+    </w:p>
+    <w:p>
+      <w:r>
+        <w:t>GeoJSON es una extensión de JSON diseñada para representar información geográfica. Cada elemento contiene:</w:t>
+      </w:r>
+      <w:r>
+        <w:br/>
+        <w:t>Un objeto geométrico con las coordenadas (latitud y longitud)</w:t>
+      </w:r>
+      <w:r>
+        <w:br/>
+        <w:t>Un conjunto de propiedades donde se almacenan los campos de la gasolinera</w:t>
+      </w:r>
+      <w:r>
+        <w:br/>
+      </w:r>
+    </w:p>
+    <w:p>
+      <w:r>
+        <w:t>Ejemplo simplificado:</w:t>
+      </w:r>
+    </w:p>
+    <w:p>
+      <w:r>
+        <w:t>{</w:t>
+      </w:r>
+      <w:r>
+        <w:br/>
+        <w:t xml:space="preserve">  "type": "Feature",</w:t>
+      </w:r>
+      <w:r>
+        <w:br/>
+        <w:t xml:space="preserve">  "geometry": {</w:t>
+      </w:r>
+      <w:r>
+        <w:br/>
+        <w:t xml:space="preserve">    "type": "Point",</w:t>
+      </w:r>
+      <w:r>
+        <w:br/>
+        <w:t xml:space="preserve">    "coordinates": [-4.724, 41.652]</w:t>
+      </w:r>
+      <w:r>
+        <w:br/>
+        <w:t xml:space="preserve">  },</w:t>
+      </w:r>
+      <w:r>
+        <w:br/>
+        <w:t xml:space="preserve">  "properties": {</w:t>
+      </w:r>
+      <w:r>
+        <w:br/>
+        <w:t xml:space="preserve">    "id": "4375",</w:t>
+      </w:r>
+      <w:r>
+        <w:br/>
+        <w:t xml:space="preserve">    "rotulo": "REPSOL",</w:t>
+      </w:r>
+      <w:r>
+        <w:br/>
+        <w:t xml:space="preserve">    "precio_g95": 1.589,</w:t>
+      </w:r>
+      <w:r>
+        <w:br/>
+        <w:t xml:space="preserve">    "precio_diesel": 1.509</w:t>
+      </w:r>
+      <w:r>
+        <w:br/>
+        <w:t xml:space="preserve">  }</w:t>
+      </w:r>
+      <w:r>
+        <w:br/>
+        <w:t>}</w:t>
+      </w:r>
+    </w:p>
+    <w:p/>
+    <w:p>
+      <w:pPr>
+        <w:rPr>
+          <w:b/>
+          <w:bCs/>
+          <w:sz w:val="28"/>
+          <w:szCs w:val="28"/>
+        </w:rPr>
+      </w:pPr>
+      <w:r>
+        <w:rPr>
+          <w:b/>
+          <w:bCs/>
+          <w:sz w:val="28"/>
+          <w:szCs w:val="28"/>
+        </w:rPr>
+        <w:t>Compatibilidad con SQLite</w:t>
+      </w:r>
+    </w:p>
+    <w:p>
+      <w:r>
+        <w:t xml:space="preserve">El formato GeoJSON </w:t>
+      </w:r>
+      <w:r>
+        <w:rPr>
+          <w:b/>
+          <w:bCs/>
+        </w:rPr>
+        <w:t>no afecta a los campos ni a la base de datos</w:t>
+      </w:r>
+      <w:r>
+        <w:t>.</w:t>
+      </w:r>
+    </w:p>
+    <w:p>
+      <w:r>
+        <w:t>SQLite no almacena el archivo GeoJSON directamente. Lo que se hace es:</w:t>
+      </w:r>
+      <w:r>
+        <w:br/>
+      </w:r>
+      <w:r>
+        <w:t xml:space="preserve">- </w:t>
+      </w:r>
+      <w:r>
+        <w:t>leer el GeoJSON</w:t>
+      </w:r>
+      <w:r>
+        <w:br/>
+      </w:r>
+      <w:r>
+        <w:t xml:space="preserve">- </w:t>
+      </w:r>
+      <w:r>
+        <w:t>extraer los campos necesarios</w:t>
+      </w:r>
+      <w:r>
+        <w:br/>
+      </w:r>
+      <w:r>
+        <w:t xml:space="preserve">- </w:t>
+      </w:r>
+      <w:r>
+        <w:t>guardar esos datos en tablas SQLite</w:t>
+      </w:r>
+      <w:r>
+        <w:br/>
+      </w:r>
+    </w:p>
+    <w:p>
+      <w:r>
+        <w:br w:type="page"/>
+      </w:r>
     </w:p>
     <w:p>
       <w:pPr>
@@ -2044,20 +2634,27 @@
           <w:b/>
           <w:sz w:val="28"/>
         </w:rPr>
-        <w:t>DISEÑO INTERFACE</w:t>
-      </w:r>
-    </w:p>
-    <w:p>
-      <w:pPr>
-        <w:rPr>
-          <w:lang w:val="en-US"/>
-        </w:rPr>
-      </w:pPr>
-      <w:r>
-        <w:rPr>
-          <w:lang w:val="en-US"/>
-        </w:rPr>
         <w:lastRenderedPageBreak/>
+        <w:t>D</w:t>
+      </w:r>
+      <w:r>
+        <w:rPr>
+          <w:b/>
+          <w:sz w:val="28"/>
+        </w:rPr>
+        <w:t>ISEÑO INTERFACE</w:t>
+      </w:r>
+    </w:p>
+    <w:p>
+      <w:pPr>
+        <w:rPr>
+          <w:lang w:val="en-US"/>
+        </w:rPr>
+      </w:pPr>
+      <w:r>
+        <w:rPr>
+          <w:lang w:val="en-US"/>
+        </w:rPr>
         <w:t xml:space="preserve">File </w:t>
       </w:r>
       <w:r>
@@ -2106,19 +2703,7 @@
         <w:rPr>
           <w:lang w:val="en-US"/>
         </w:rPr>
-        <w:t xml:space="preserve"> </w:t>
-      </w:r>
-      <w:r>
-        <w:rPr>
-          <w:lang w:val="en-US"/>
-        </w:rPr>
-        <w:t>Plugins</w:t>
-      </w:r>
-      <w:r>
-        <w:rPr>
-          <w:lang w:val="en-US"/>
-        </w:rPr>
-        <w:t xml:space="preserve"> </w:t>
+        <w:t xml:space="preserve"> Plugins </w:t>
       </w:r>
       <w:r>
         <w:rPr>
@@ -2191,15 +2776,7 @@
       </w:r>
     </w:p>
     <w:p>
-      <w:pPr>
-        <w:rPr>
-          <w:lang w:val="en-US"/>
-        </w:rPr>
-      </w:pPr>
-      <w:r>
-        <w:rPr>
-          <w:lang w:val="en-US"/>
-        </w:rPr>
+      <w:r>
         <w:t xml:space="preserve">Click derecho sobre un package </w:t>
       </w:r>
       <w:r>
@@ -2222,37 +2799,10 @@
         </mc:AlternateContent>
       </w:r>
       <w:r>
-        <w:rPr>
-          <w:lang w:val="en-US"/>
-        </w:rPr>
-        <w:t xml:space="preserve"> </w:t>
-      </w:r>
-      <w:r>
-        <w:rPr>
-          <w:lang w:val="en-US"/>
-        </w:rPr>
-        <w:t xml:space="preserve">New </w:t>
-      </w:r>
-      <w:r>
-        <w:rPr>
-          <w:lang w:val="en-US"/>
-        </w:rPr>
-        <w:t>-</w:t>
-      </w:r>
-      <w:r>
-        <w:rPr>
-          <w:lang w:val="en-US"/>
-        </w:rPr>
-        <w:t xml:space="preserve"> GUI Form</w:t>
-      </w:r>
-    </w:p>
-    <w:p>
-      <w:pPr>
-        <w:rPr>
-          <w:lang w:val="en-US"/>
-        </w:rPr>
-      </w:pPr>
-    </w:p>
+        <w:t xml:space="preserve"> New - GUI Form</w:t>
+      </w:r>
+    </w:p>
+    <w:p/>
     <w:p>
       <w:r>
         <w:t xml:space="preserve">Scene Builder </w:t>
@@ -2288,8 +2838,11 @@
     <w:p/>
     <w:p>
       <w:r>
+        <w:rPr>
+          <w:noProof/>
+        </w:rPr>
         <w:drawing>
-          <wp:anchor distT="0" distB="0" distL="114300" distR="114300" simplePos="0" relativeHeight="251659264" behindDoc="1" locked="0" layoutInCell="1" allowOverlap="1">
+          <wp:anchor distT="0" distB="0" distL="114300" distR="114300" simplePos="0" relativeHeight="251659264" behindDoc="1" locked="0" layoutInCell="1" allowOverlap="1" wp14:anchorId="6C490862" wp14:editId="48D382AD">
             <wp:simplePos x="0" y="0"/>
             <wp:positionH relativeFrom="column">
               <wp:posOffset>-989965</wp:posOffset>
@@ -2358,7 +2911,7 @@
 </file>
 
 <file path=word/endnotes.xml><?xml version="1.0" encoding="utf-8"?>
-<w:endnotes xmlns:wpc="http://schemas.microsoft.com/office/word/2010/wordprocessingCanvas" xmlns:cx="http://schemas.microsoft.com/office/drawing/2014/chartex" xmlns:mc="http://schemas.openxmlformats.org/markup-compatibility/2006" xmlns:o="urn:schemas-microsoft-com:office:office" xmlns:r="http://schemas.openxmlformats.org/officeDocument/2006/relationships" xmlns:m="http://schemas.openxmlformats.org/officeDocument/2006/math" xmlns:v="urn:schemas-microsoft-com:vml" xmlns:wp14="http://schemas.microsoft.com/office/word/2010/wordprocessingDrawing" xmlns:wp="http://schemas.openxmlformats.org/drawingml/2006/wordprocessingDrawing" xmlns:w10="urn:schemas-microsoft-com:office:word" xmlns:w="http://schemas.openxmlformats.org/wordprocessingml/2006/main" xmlns:w14="http://schemas.microsoft.com/office/word/2010/wordml" xmlns:w15="http://schemas.microsoft.com/office/word/2012/wordml" xmlns:w16se="http://schemas.microsoft.com/office/word/2015/wordml/symex" xmlns:wpg="http://schemas.microsoft.com/office/word/2010/wordprocessingGroup" xmlns:wpi="http://schemas.microsoft.com/office/word/2010/wordprocessingInk" xmlns:wne="http://schemas.microsoft.com/office/word/2006/wordml" xmlns:wps="http://schemas.microsoft.com/office/word/2010/wordprocessingShape" mc:Ignorable="w14 w15 w16se wp14">
+<w:endnotes xmlns:wpc="http://schemas.microsoft.com/office/word/2010/wordprocessingCanvas" xmlns:cx="http://schemas.microsoft.com/office/drawing/2014/chartex" xmlns:cx1="http://schemas.microsoft.com/office/drawing/2015/9/8/chartex" xmlns:cx2="http://schemas.microsoft.com/office/drawing/2015/10/21/chartex" xmlns:cx3="http://schemas.microsoft.com/office/drawing/2016/5/9/chartex" xmlns:cx4="http://schemas.microsoft.com/office/drawing/2016/5/10/chartex" xmlns:cx5="http://schemas.microsoft.com/office/drawing/2016/5/11/chartex" xmlns:cx6="http://schemas.microsoft.com/office/drawing/2016/5/12/chartex" xmlns:cx7="http://schemas.microsoft.com/office/drawing/2016/5/13/chartex" xmlns:cx8="http://schemas.microsoft.com/office/drawing/2016/5/14/chartex" xmlns:mc="http://schemas.openxmlformats.org/markup-compatibility/2006" xmlns:aink="http://schemas.microsoft.com/office/drawing/2016/ink" xmlns:am3d="http://schemas.microsoft.com/office/drawing/2017/model3d" xmlns:o="urn:schemas-microsoft-com:office:office" xmlns:oel="http://schemas.microsoft.com/office/2019/extlst" xmlns:r="http://schemas.openxmlformats.org/officeDocument/2006/relationships" xmlns:m="http://schemas.openxmlformats.org/officeDocument/2006/math" xmlns:v="urn:schemas-microsoft-com:vml" xmlns:wp14="http://schemas.microsoft.com/office/word/2010/wordprocessingDrawing" xmlns:wp="http://schemas.openxmlformats.org/drawingml/2006/wordprocessingDrawing" xmlns:w10="urn:schemas-microsoft-com:office:word" xmlns:w="http://schemas.openxmlformats.org/wordprocessingml/2006/main" xmlns:w14="http://schemas.microsoft.com/office/word/2010/wordml" xmlns:w15="http://schemas.microsoft.com/office/word/2012/wordml" xmlns:w16cex="http://schemas.microsoft.com/office/word/2018/wordml/cex" xmlns:w16cid="http://schemas.microsoft.com/office/word/2016/wordml/cid" xmlns:w16="http://schemas.microsoft.com/office/word/2018/wordml" xmlns:w16du="http://schemas.microsoft.com/office/word/2023/wordml/word16du" xmlns:w16sdtdh="http://schemas.microsoft.com/office/word/2020/wordml/sdtdatahash" xmlns:w16sdtfl="http://schemas.microsoft.com/office/word/2024/wordml/sdtformatlock" xmlns:w16se="http://schemas.microsoft.com/office/word/2015/wordml/symex" xmlns:wpg="http://schemas.microsoft.com/office/word/2010/wordprocessingGroup" xmlns:wpi="http://schemas.microsoft.com/office/word/2010/wordprocessingInk" xmlns:wne="http://schemas.microsoft.com/office/word/2006/wordml" xmlns:wps="http://schemas.microsoft.com/office/word/2010/wordprocessingShape" mc:Ignorable="w14 w15 w16se w16cid w16 w16cex w16sdtdh w16sdtfl w16du wp14">
   <w:endnote w:type="separator" w:id="-1">
     <w:p>
       <w:pPr>
@@ -2383,7 +2936,7 @@
 </file>
 
 <file path=word/footnotes.xml><?xml version="1.0" encoding="utf-8"?>
-<w:footnotes xmlns:wpc="http://schemas.microsoft.com/office/word/2010/wordprocessingCanvas" xmlns:cx="http://schemas.microsoft.com/office/drawing/2014/chartex" xmlns:mc="http://schemas.openxmlformats.org/markup-compatibility/2006" xmlns:o="urn:schemas-microsoft-com:office:office" xmlns:r="http://schemas.openxmlformats.org/officeDocument/2006/relationships" xmlns:m="http://schemas.openxmlformats.org/officeDocument/2006/math" xmlns:v="urn:schemas-microsoft-com:vml" xmlns:wp14="http://schemas.microsoft.com/office/word/2010/wordprocessingDrawing" xmlns:wp="http://schemas.openxmlformats.org/drawingml/2006/wordprocessingDrawing" xmlns:w10="urn:schemas-microsoft-com:office:word" xmlns:w="http://schemas.openxmlformats.org/wordprocessingml/2006/main" xmlns:w14="http://schemas.microsoft.com/office/word/2010/wordml" xmlns:w15="http://schemas.microsoft.com/office/word/2012/wordml" xmlns:w16se="http://schemas.microsoft.com/office/word/2015/wordml/symex" xmlns:wpg="http://schemas.microsoft.com/office/word/2010/wordprocessingGroup" xmlns:wpi="http://schemas.microsoft.com/office/word/2010/wordprocessingInk" xmlns:wne="http://schemas.microsoft.com/office/word/2006/wordml" xmlns:wps="http://schemas.microsoft.com/office/word/2010/wordprocessingShape" mc:Ignorable="w14 w15 w16se wp14">
+<w:footnotes xmlns:wpc="http://schemas.microsoft.com/office/word/2010/wordprocessingCanvas" xmlns:cx="http://schemas.microsoft.com/office/drawing/2014/chartex" xmlns:cx1="http://schemas.microsoft.com/office/drawing/2015/9/8/chartex" xmlns:cx2="http://schemas.microsoft.com/office/drawing/2015/10/21/chartex" xmlns:cx3="http://schemas.microsoft.com/office/drawing/2016/5/9/chartex" xmlns:cx4="http://schemas.microsoft.com/office/drawing/2016/5/10/chartex" xmlns:cx5="http://schemas.microsoft.com/office/drawing/2016/5/11/chartex" xmlns:cx6="http://schemas.microsoft.com/office/drawing/2016/5/12/chartex" xmlns:cx7="http://schemas.microsoft.com/office/drawing/2016/5/13/chartex" xmlns:cx8="http://schemas.microsoft.com/office/drawing/2016/5/14/chartex" xmlns:mc="http://schemas.openxmlformats.org/markup-compatibility/2006" xmlns:aink="http://schemas.microsoft.com/office/drawing/2016/ink" xmlns:am3d="http://schemas.microsoft.com/office/drawing/2017/model3d" xmlns:o="urn:schemas-microsoft-com:office:office" xmlns:oel="http://schemas.microsoft.com/office/2019/extlst" xmlns:r="http://schemas.openxmlformats.org/officeDocument/2006/relationships" xmlns:m="http://schemas.openxmlformats.org/officeDocument/2006/math" xmlns:v="urn:schemas-microsoft-com:vml" xmlns:wp14="http://schemas.microsoft.com/office/word/2010/wordprocessingDrawing" xmlns:wp="http://schemas.openxmlformats.org/drawingml/2006/wordprocessingDrawing" xmlns:w10="urn:schemas-microsoft-com:office:word" xmlns:w="http://schemas.openxmlformats.org/wordprocessingml/2006/main" xmlns:w14="http://schemas.microsoft.com/office/word/2010/wordml" xmlns:w15="http://schemas.microsoft.com/office/word/2012/wordml" xmlns:w16cex="http://schemas.microsoft.com/office/word/2018/wordml/cex" xmlns:w16cid="http://schemas.microsoft.com/office/word/2016/wordml/cid" xmlns:w16="http://schemas.microsoft.com/office/word/2018/wordml" xmlns:w16du="http://schemas.microsoft.com/office/word/2023/wordml/word16du" xmlns:w16sdtdh="http://schemas.microsoft.com/office/word/2020/wordml/sdtdatahash" xmlns:w16sdtfl="http://schemas.microsoft.com/office/word/2024/wordml/sdtformatlock" xmlns:w16se="http://schemas.microsoft.com/office/word/2015/wordml/symex" xmlns:wpg="http://schemas.microsoft.com/office/word/2010/wordprocessingGroup" xmlns:wpi="http://schemas.microsoft.com/office/word/2010/wordprocessingInk" xmlns:wne="http://schemas.microsoft.com/office/word/2006/wordml" xmlns:wps="http://schemas.microsoft.com/office/word/2010/wordprocessingShape" mc:Ignorable="w14 w15 w16se w16cid w16 w16cex w16sdtdh w16sdtfl w16du wp14">
   <w:footnote w:type="separator" w:id="-1">
     <w:p>
       <w:pPr>
@@ -2408,7 +2961,7 @@
 </file>
 
 <file path=word/numbering.xml><?xml version="1.0" encoding="utf-8"?>
-<w:numbering xmlns:wpc="http://schemas.microsoft.com/office/word/2010/wordprocessingCanvas" xmlns:cx="http://schemas.microsoft.com/office/drawing/2014/chartex" xmlns:mc="http://schemas.openxmlformats.org/markup-compatibility/2006" xmlns:o="urn:schemas-microsoft-com:office:office" xmlns:r="http://schemas.openxmlformats.org/officeDocument/2006/relationships" xmlns:m="http://schemas.openxmlformats.org/officeDocument/2006/math" xmlns:v="urn:schemas-microsoft-com:vml" xmlns:wp14="http://schemas.microsoft.com/office/word/2010/wordprocessingDrawing" xmlns:wp="http://schemas.openxmlformats.org/drawingml/2006/wordprocessingDrawing" xmlns:w10="urn:schemas-microsoft-com:office:word" xmlns:w="http://schemas.openxmlformats.org/wordprocessingml/2006/main" xmlns:w14="http://schemas.microsoft.com/office/word/2010/wordml" xmlns:w15="http://schemas.microsoft.com/office/word/2012/wordml" xmlns:w16se="http://schemas.microsoft.com/office/word/2015/wordml/symex" xmlns:wpg="http://schemas.microsoft.com/office/word/2010/wordprocessingGroup" xmlns:wpi="http://schemas.microsoft.com/office/word/2010/wordprocessingInk" xmlns:wne="http://schemas.microsoft.com/office/word/2006/wordml" xmlns:wps="http://schemas.microsoft.com/office/word/2010/wordprocessingShape" mc:Ignorable="w14 w15 w16se wp14">
+<w:numbering xmlns:wpc="http://schemas.microsoft.com/office/word/2010/wordprocessingCanvas" xmlns:cx="http://schemas.microsoft.com/office/drawing/2014/chartex" xmlns:cx1="http://schemas.microsoft.com/office/drawing/2015/9/8/chartex" xmlns:cx2="http://schemas.microsoft.com/office/drawing/2015/10/21/chartex" xmlns:cx3="http://schemas.microsoft.com/office/drawing/2016/5/9/chartex" xmlns:cx4="http://schemas.microsoft.com/office/drawing/2016/5/10/chartex" xmlns:cx5="http://schemas.microsoft.com/office/drawing/2016/5/11/chartex" xmlns:cx6="http://schemas.microsoft.com/office/drawing/2016/5/12/chartex" xmlns:cx7="http://schemas.microsoft.com/office/drawing/2016/5/13/chartex" xmlns:cx8="http://schemas.microsoft.com/office/drawing/2016/5/14/chartex" xmlns:mc="http://schemas.openxmlformats.org/markup-compatibility/2006" xmlns:aink="http://schemas.microsoft.com/office/drawing/2016/ink" xmlns:am3d="http://schemas.microsoft.com/office/drawing/2017/model3d" xmlns:o="urn:schemas-microsoft-com:office:office" xmlns:oel="http://schemas.microsoft.com/office/2019/extlst" xmlns:r="http://schemas.openxmlformats.org/officeDocument/2006/relationships" xmlns:m="http://schemas.openxmlformats.org/officeDocument/2006/math" xmlns:v="urn:schemas-microsoft-com:vml" xmlns:wp14="http://schemas.microsoft.com/office/word/2010/wordprocessingDrawing" xmlns:wp="http://schemas.openxmlformats.org/drawingml/2006/wordprocessingDrawing" xmlns:w10="urn:schemas-microsoft-com:office:word" xmlns:w="http://schemas.openxmlformats.org/wordprocessingml/2006/main" xmlns:w14="http://schemas.microsoft.com/office/word/2010/wordml" xmlns:w15="http://schemas.microsoft.com/office/word/2012/wordml" xmlns:w16cex="http://schemas.microsoft.com/office/word/2018/wordml/cex" xmlns:w16cid="http://schemas.microsoft.com/office/word/2016/wordml/cid" xmlns:w16="http://schemas.microsoft.com/office/word/2018/wordml" xmlns:w16du="http://schemas.microsoft.com/office/word/2023/wordml/word16du" xmlns:w16sdtdh="http://schemas.microsoft.com/office/word/2020/wordml/sdtdatahash" xmlns:w16sdtfl="http://schemas.microsoft.com/office/word/2024/wordml/sdtformatlock" xmlns:w16se="http://schemas.microsoft.com/office/word/2015/wordml/symex" xmlns:wpg="http://schemas.microsoft.com/office/word/2010/wordprocessingGroup" xmlns:wpi="http://schemas.microsoft.com/office/word/2010/wordprocessingInk" xmlns:wne="http://schemas.microsoft.com/office/word/2006/wordml" xmlns:wps="http://schemas.microsoft.com/office/word/2010/wordprocessingShape" mc:Ignorable="w14 w15 w16se w16cid w16 w16cex w16sdtdh w16sdtfl w16du wp14">
   <w:abstractNum w:abstractNumId="0" w15:restartNumberingAfterBreak="0">
     <w:nsid w:val="28AA3BCA"/>
     <w:multiLevelType w:val="multilevel"/>
@@ -2670,17 +3223,133 @@
       </w:rPr>
     </w:lvl>
   </w:abstractNum>
-  <w:num w:numId="1">
+  <w:abstractNum w:abstractNumId="2" w15:restartNumberingAfterBreak="0">
+    <w:nsid w:val="718D7F93"/>
+    <w:multiLevelType w:val="hybridMultilevel"/>
+    <w:tmpl w:val="0FB2811C"/>
+    <w:lvl w:ilvl="0" w:tplc="0C0A0001">
+      <w:start w:val="1"/>
+      <w:numFmt w:val="bullet"/>
+      <w:lvlText w:val=""/>
+      <w:lvlJc w:val="left"/>
+      <w:pPr>
+        <w:ind w:left="720" w:hanging="360"/>
+      </w:pPr>
+      <w:rPr>
+        <w:rFonts w:ascii="Symbol" w:hAnsi="Symbol" w:hint="default"/>
+      </w:rPr>
+    </w:lvl>
+    <w:lvl w:ilvl="1" w:tplc="0C0A0003" w:tentative="1">
+      <w:start w:val="1"/>
+      <w:numFmt w:val="bullet"/>
+      <w:lvlText w:val="o"/>
+      <w:lvlJc w:val="left"/>
+      <w:pPr>
+        <w:ind w:left="1440" w:hanging="360"/>
+      </w:pPr>
+      <w:rPr>
+        <w:rFonts w:ascii="Courier New" w:hAnsi="Courier New" w:cs="Courier New" w:hint="default"/>
+      </w:rPr>
+    </w:lvl>
+    <w:lvl w:ilvl="2" w:tplc="0C0A0005" w:tentative="1">
+      <w:start w:val="1"/>
+      <w:numFmt w:val="bullet"/>
+      <w:lvlText w:val=""/>
+      <w:lvlJc w:val="left"/>
+      <w:pPr>
+        <w:ind w:left="2160" w:hanging="360"/>
+      </w:pPr>
+      <w:rPr>
+        <w:rFonts w:ascii="Wingdings" w:hAnsi="Wingdings" w:hint="default"/>
+      </w:rPr>
+    </w:lvl>
+    <w:lvl w:ilvl="3" w:tplc="0C0A0001" w:tentative="1">
+      <w:start w:val="1"/>
+      <w:numFmt w:val="bullet"/>
+      <w:lvlText w:val=""/>
+      <w:lvlJc w:val="left"/>
+      <w:pPr>
+        <w:ind w:left="2880" w:hanging="360"/>
+      </w:pPr>
+      <w:rPr>
+        <w:rFonts w:ascii="Symbol" w:hAnsi="Symbol" w:hint="default"/>
+      </w:rPr>
+    </w:lvl>
+    <w:lvl w:ilvl="4" w:tplc="0C0A0003" w:tentative="1">
+      <w:start w:val="1"/>
+      <w:numFmt w:val="bullet"/>
+      <w:lvlText w:val="o"/>
+      <w:lvlJc w:val="left"/>
+      <w:pPr>
+        <w:ind w:left="3600" w:hanging="360"/>
+      </w:pPr>
+      <w:rPr>
+        <w:rFonts w:ascii="Courier New" w:hAnsi="Courier New" w:cs="Courier New" w:hint="default"/>
+      </w:rPr>
+    </w:lvl>
+    <w:lvl w:ilvl="5" w:tplc="0C0A0005" w:tentative="1">
+      <w:start w:val="1"/>
+      <w:numFmt w:val="bullet"/>
+      <w:lvlText w:val=""/>
+      <w:lvlJc w:val="left"/>
+      <w:pPr>
+        <w:ind w:left="4320" w:hanging="360"/>
+      </w:pPr>
+      <w:rPr>
+        <w:rFonts w:ascii="Wingdings" w:hAnsi="Wingdings" w:hint="default"/>
+      </w:rPr>
+    </w:lvl>
+    <w:lvl w:ilvl="6" w:tplc="0C0A0001" w:tentative="1">
+      <w:start w:val="1"/>
+      <w:numFmt w:val="bullet"/>
+      <w:lvlText w:val=""/>
+      <w:lvlJc w:val="left"/>
+      <w:pPr>
+        <w:ind w:left="5040" w:hanging="360"/>
+      </w:pPr>
+      <w:rPr>
+        <w:rFonts w:ascii="Symbol" w:hAnsi="Symbol" w:hint="default"/>
+      </w:rPr>
+    </w:lvl>
+    <w:lvl w:ilvl="7" w:tplc="0C0A0003" w:tentative="1">
+      <w:start w:val="1"/>
+      <w:numFmt w:val="bullet"/>
+      <w:lvlText w:val="o"/>
+      <w:lvlJc w:val="left"/>
+      <w:pPr>
+        <w:ind w:left="5760" w:hanging="360"/>
+      </w:pPr>
+      <w:rPr>
+        <w:rFonts w:ascii="Courier New" w:hAnsi="Courier New" w:cs="Courier New" w:hint="default"/>
+      </w:rPr>
+    </w:lvl>
+    <w:lvl w:ilvl="8" w:tplc="0C0A0005" w:tentative="1">
+      <w:start w:val="1"/>
+      <w:numFmt w:val="bullet"/>
+      <w:lvlText w:val=""/>
+      <w:lvlJc w:val="left"/>
+      <w:pPr>
+        <w:ind w:left="6480" w:hanging="360"/>
+      </w:pPr>
+      <w:rPr>
+        <w:rFonts w:ascii="Wingdings" w:hAnsi="Wingdings" w:hint="default"/>
+      </w:rPr>
+    </w:lvl>
+  </w:abstractNum>
+  <w:num w:numId="1" w16cid:durableId="1263997116">
     <w:abstractNumId w:val="0"/>
   </w:num>
-  <w:num w:numId="2">
+  <w:num w:numId="2" w16cid:durableId="2074624048">
     <w:abstractNumId w:val="1"/>
+  </w:num>
+  <w:num w:numId="3" w16cid:durableId="336539603">
+    <w:abstractNumId w:val="2"/>
   </w:num>
 </w:numbering>
 </file>
 
 <file path=word/styles.xml><?xml version="1.0" encoding="utf-8"?>
-<w:styles xmlns:mc="http://schemas.openxmlformats.org/markup-compatibility/2006" xmlns:r="http://schemas.openxmlformats.org/officeDocument/2006/relationships" xmlns:w="http://schemas.openxmlformats.org/wordprocessingml/2006/main" xmlns:w14="http://schemas.microsoft.com/office/word/2010/wordml" xmlns:w15="http://schemas.microsoft.com/office/word/2012/wordml" xmlns:w16se="http://schemas.microsoft.com/office/word/2015/wordml/symex" mc:Ignorable="w14 w15 w16se">
+<w:styles xmlns:mc="http://schemas.openxmlformats.org/markup-compatibility/2006" xmlns:r="http://schemas.openxmlformats.org/officeDocument/2006/relationships" xmlns:w="http://schemas.openxmlformats.org/wordprocessingml/2006/main" xmlns:w14="http://schemas.microsoft.com/office/word/2010/wordml" xmlns:w15="http://schemas.microsoft.com/office/word/2012/wordml" xmlns:w16cex="http://schemas.microsoft.com/office/word/2018/wordml/cex" xmlns:w16cid="http://schemas.microsoft.com/office/word/2016/wordml/cid" xmlns:w16="http://schemas.microsoft.com/office/word/2018/wordml" xmlns:w16du="http://schemas.microsoft.com/office/word/2023/wordml/word16du" xmlns:w16sdtdh="http://schemas.microsoft.com/office/word/2020/wordml/sdtdatahash" xmlns:w16sdtfl="http://schemas.microsoft.com/office/word/2024/wordml/sdtformatlock" xmlns:w16se="http://schemas.microsoft.com/office/word/2015/wordml/symex" mc:Ignorable="w14 w15 w16se w16cid w16 w16cex w16sdtdh w16sdtfl w16du">
   <w:docDefaults>
     <w:rPrDefault>
       <w:rPr>
@@ -2696,7 +3365,7 @@
       </w:pPr>
     </w:pPrDefault>
   </w:docDefaults>
-  <w:latentStyles w:defLockedState="0" w:defUIPriority="99" w:defSemiHidden="0" w:defUnhideWhenUsed="0" w:defQFormat="0" w:count="371">
+  <w:latentStyles w:defLockedState="0" w:defUIPriority="99" w:defSemiHidden="0" w:defUnhideWhenUsed="0" w:defQFormat="0" w:count="376">
     <w:lsdException w:name="Normal" w:uiPriority="0" w:qFormat="1"/>
     <w:lsdException w:name="heading 1" w:uiPriority="9" w:qFormat="1"/>
     <w:lsdException w:name="heading 2" w:semiHidden="1" w:uiPriority="9" w:unhideWhenUsed="1" w:qFormat="1"/>
@@ -3068,6 +3737,11 @@
     <w:lsdException w:name="List Table 5 Dark Accent 6" w:uiPriority="50"/>
     <w:lsdException w:name="List Table 6 Colorful Accent 6" w:uiPriority="51"/>
     <w:lsdException w:name="List Table 7 Colorful Accent 6" w:uiPriority="52"/>
+    <w:lsdException w:name="Mention" w:semiHidden="1" w:unhideWhenUsed="1"/>
+    <w:lsdException w:name="Smart Hyperlink" w:semiHidden="1" w:unhideWhenUsed="1"/>
+    <w:lsdException w:name="Hashtag" w:semiHidden="1" w:unhideWhenUsed="1"/>
+    <w:lsdException w:name="Unresolved Mention" w:semiHidden="1" w:unhideWhenUsed="1"/>
+    <w:lsdException w:name="Smart Link" w:semiHidden="1" w:unhideWhenUsed="1"/>
   </w:latentStyles>
   <w:style w:type="paragraph" w:default="1" w:styleId="Normal">
     <w:name w:val="Normal"/>
@@ -3076,7 +3750,6 @@
   <w:style w:type="character" w:default="1" w:styleId="Fuentedeprrafopredeter">
     <w:name w:val="Default Paragraph Font"/>
     <w:uiPriority w:val="1"/>
-    <w:semiHidden/>
     <w:unhideWhenUsed/>
   </w:style>
   <w:style w:type="table" w:default="1" w:styleId="Tablanormal">

</xml_diff>